<commit_message>
refactor: finalizar cambio FOLIO → SEMA (email, docs)
Co-Authored-By: Claude Sonnet 5.5 <noreply@anthropic.com>
</commit_message>
<xml_diff>
--- a/DOCUMENTACION_PARA_DUMMIES.docx
+++ b/DOCUMENTACION_PARA_DUMMIES.docx
@@ -15,7 +15,7 @@
           <w:color w:val="7A2E2E"/>
           <w:sz w:val="80"/>
         </w:rPr>
-        <w:t>FOLIO — Guía para cofundadores, sin tecnicismos</w:t>
+        <w:t>SEMA — Guía para cofundadores, sin tecnicismos</w:t>
       </w:r>
     </w:p>
     <w:p>
@@ -62,7 +62,7 @@
           <w:color w:val="7A2E2E"/>
           <w:sz w:val="40"/>
         </w:rPr>
-        <w:t>1. ¿Qué es FOLIO en una sola oración?</w:t>
+        <w:t>1. ¿Qué es SEMA en una sola oración?</w:t>
       </w:r>
     </w:p>
     <w:p>
@@ -85,7 +85,7 @@
           <w:color w:val="2A221E"/>
           <w:sz w:val="23"/>
         </w:rPr>
-        <w:t>FOLIO es una app para llevar tu biblioteca personal, mantener el hábito de leer con una racha diaria y una mascota que crece contigo, platicar de libros con tus amigos, y hasta intercambiar libros físicos con otros lectores — pensada para gente joven en México a la que le cuesta trabajo agarrarle el ritmo a la lectura.</w:t>
+        <w:t>SEMA es una app para llevar tu biblioteca personal, mantener el hábito de leer con una racha diaria y una mascota que crece contigo, platicar de libros con tus amigos, y hasta intercambiar libros físicos con otros lectores — pensada para gente joven en México a la que le cuesta trabajo agarrarle el ritmo a la lectura.</w:t>
       </w:r>
     </w:p>
     <w:p>
@@ -128,7 +128,7 @@
           <w:color w:val="2A221E"/>
           <w:sz w:val="23"/>
         </w:rPr>
-        <w:t>Imagina que Folio es un restaurante. El cliente —la persona que usa la app en su celular— nunca entra a la cocina: solo ve el menú, pide lo que quiere, y el mesero le trae el platillo. Esa parte que el cliente sí ve y toca —los botones, las pantallas, los colores— es lo que en software se llama el "frontend". Es literalmente lo único que corre dentro del teléfono de la persona.</w:t>
+        <w:t>Imagina que SEMA es un restaurante. El cliente —la persona que usa la app en su celular— nunca entra a la cocina: solo ve el menú, pide lo que quiere, y el mesero le trae el platillo. Esa parte que el cliente sí ve y toca —los botones, las pantallas, los colores— es lo que en software se llama el "frontend". Es literalmente lo único que corre dentro del teléfono de la persona.</w:t>
       </w:r>
     </w:p>
     <w:p>
@@ -173,7 +173,7 @@
           <w:color w:val="2A221E"/>
           <w:sz w:val="23"/>
         </w:rPr>
-        <w:t>¿Y en Folio, específicamente? El menú (el frontend) es el código que se descarga al navegador o celular del usuario cuando abre la app; incluso se puede "instalar" como si fuera una app nativa, aunque por dentro sigue siendo una página web. La cocina y la bodega casi no las construimos nosotros desde cero: rentamos ambas, ya armadas y con seguridad incluida, a un proveedor llamado Supabase. Solo un par de tareas puntuales —como pedirle a una Inteligencia Artificial que resuma un libro, o buscar un título en Google— corren en cocinas propias muy pequeñas, rentadas a otro proveedor llamado Vercel.</w:t>
+        <w:t>¿Y en SEMA, específicamente? El menú (el frontend) es el código que se descarga al navegador o celular del usuario cuando abre la app; incluso se puede "instalar" como si fuera una app nativa, aunque por dentro sigue siendo una página web. La cocina y la bodega casi no las construimos nosotros desde cero: rentamos ambas, ya armadas y con seguridad incluida, a un proveedor llamado Supabase. Solo un par de tareas puntuales —como pedirle a una Inteligencia Artificial que resuma un libro, o buscar un título en Google— corren en cocinas propias muy pequeñas, rentadas a otro proveedor llamado Vercel.</w:t>
       </w:r>
     </w:p>
     <w:p>
@@ -369,7 +369,7 @@
           <w:color w:val="2A221E"/>
           <w:sz w:val="23"/>
         </w:rPr>
-        <w:t xml:space="preserve"> Es la base de libros de Google. Cuando el usuario busca un título, Folio le pregunta a Google Books por título, autor, portada e ISBN (el "número de serie" único de cada edición de un libro). Pedimos primero resultados en español; si hay menos de 3, buscamos en todos los idiomas y mezclamos. Lo que nos falta: muchas ediciones en español, sobre todo de editoriales mexicanas o libros de texto universitarios, están mal documentadas — a veces no traen portada, o el resumen viene incompleto o solo en inglés.</w:t>
+        <w:t xml:space="preserve"> Es la base de libros de Google. Cuando el usuario busca un título, SEMA le pregunta a Google Books por título, autor, portada e ISBN (el "número de serie" único de cada edición de un libro). Pedimos primero resultados en español; si hay menos de 3, buscamos en todos los idiomas y mezclamos. Lo que nos falta: muchas ediciones en español, sobre todo de editoriales mexicanas o libros de texto universitarios, están mal documentadas — a veces no traen portada, o el resumen viene incompleto o solo en inglés.</w:t>
       </w:r>
     </w:p>
     <w:p>
@@ -419,7 +419,7 @@
           <w:color w:val="2A221E"/>
           <w:sz w:val="23"/>
         </w:rPr>
-        <w:t xml:space="preserve"> Una vez que el libro ya está en la biblioteca del usuario, le pedimos a la IA que "enriquezca" ese libro — en palabras simples: que rellene los huecos. Le mandamos el título y el autor, y ella nos regresa el género, un resumen corto, y unas etiquetas de "para qué estado de ánimo sirve este libro" (por ejemplo, "reconfortante" o "para pensar"). Esto es lo que le da a Folio ese toque de personalización que Google Books solo no podría dar.</w:t>
+        <w:t xml:space="preserve"> Una vez que el libro ya está en la biblioteca del usuario, le pedimos a la IA que "enriquezca" ese libro — en palabras simples: que rellene los huecos. Le mandamos el título y el autor, y ella nos regresa el género, un resumen corto, y unas etiquetas de "para qué estado de ánimo sirve este libro" (por ejemplo, "reconfortante" o "para pensar"). Esto es lo que le da a SEMA ese toque de personalización que Google Books solo no podría dar.</w:t>
       </w:r>
     </w:p>
     <w:p>
@@ -650,7 +650,7 @@
           <w:color w:val="2A221E"/>
           <w:sz w:val="23"/>
         </w:rPr>
-        <w:t xml:space="preserve"> La más sencilla de las tres. Cuando alguien busca un libro en Folio, le ponemos un botón que dice "Ver en Biblioteca UAM", y ese botón simplemente abre Primo con la búsqueda de ese libro ya hecha. No hay ninguna conexión técnica real entre las dos apps — es nada más un enlace inteligente que le ahorra al estudiante el paso de ir a buscar por su cuenta.</w:t>
+        <w:t xml:space="preserve"> La más sencilla de las tres. Cuando alguien busca un libro en SEMA, le ponemos un botón que dice "Ver en Biblioteca UAM", y ese botón simplemente abre Primo con la búsqueda de ese libro ya hecha. No hay ninguna conexión técnica real entre las dos apps — es nada más un enlace inteligente que le ahorra al estudiante el paso de ir a buscar por su cuenta.</w:t>
       </w:r>
     </w:p>
     <w:p>
@@ -703,7 +703,7 @@
           <w:color w:val="2A221E"/>
           <w:sz w:val="23"/>
         </w:rPr>
-        <w:t xml:space="preserve"> Qué libros buscan y leen más los estudiantes de la UAM dentro de Folio. Es información que a ellos, como biblioteca, les puede servir para decidir qué comprar o qué promover, y que nosotros les podemos dar sin revelar quién es quién.</w:t>
+        <w:t xml:space="preserve"> Qué libros buscan y leen más los estudiantes de la UAM dentro de SEMA. Es información que a ellos, como biblioteca, les puede servir para decidir qué comprar o qué promover, y que nosotros les podemos dar sin revelar quién es quién.</w:t>
       </w:r>
     </w:p>
     <w:p>
@@ -728,7 +728,7 @@
           <w:color w:val="2A221E"/>
           <w:sz w:val="23"/>
         </w:rPr>
-        <w:t xml:space="preserve"> Muchos estudiantes quizás ni saben todo lo que ya tiene su propia biblioteca digital; si Folio se los muestra dentro de una app que ya usan para leer, les da alcance sin que ellos tengan que hacer marketing.</w:t>
+        <w:t xml:space="preserve"> Muchos estudiantes quizás ni saben todo lo que ya tiene su propia biblioteca digital; si SEMA se los muestra dentro de una app que ya usan para leer, les da alcance sin que ellos tengan que hacer marketing.</w:t>
       </w:r>
     </w:p>
     <w:p>
@@ -881,7 +881,7 @@
           <w:color w:val="2A221E"/>
           <w:sz w:val="23"/>
         </w:rPr>
-        <w:t xml:space="preserve"> Importa mucho: si un estudiante puede leer el PDF directo desde Folio sin volver a loguearse, la experiencia es mucho mejor; si necesita su cuenta institucional, hay que diseñar ese paso extra desde ahora.</w:t>
+        <w:t xml:space="preserve"> Importa mucho: si un estudiante puede leer el PDF directo desde SEMA sin volver a loguearse, la experiencia es mucho mejor; si necesita su cuenta institucional, hay que diseñar ese paso extra desde ahora.</w:t>
       </w:r>
     </w:p>
     <w:p>
@@ -1059,7 +1059,7 @@
           <w:color w:val="2A221E"/>
           <w:sz w:val="23"/>
         </w:rPr>
-        <w:t xml:space="preserve"> el proveedor que le renta a Folio, ya armados, la cocina (servidor) y la bodega (base de datos), con seguridad incluida.</w:t>
+        <w:t xml:space="preserve"> el proveedor que le renta a SEMA, ya armados, la cocina (servidor) y la bodega (base de datos), con seguridad incluida.</w:t>
       </w:r>
     </w:p>
     <w:p>
@@ -1234,7 +1234,7 @@
           <w:color w:val="2A221E"/>
           <w:sz w:val="23"/>
         </w:rPr>
-        <w:t xml:space="preserve"> cuando dos sistemas de software distintos (por ejemplo, Folio y Alma) se conectan entre sí para compartir información automáticamente, sin que alguien tenga que copiar y pegar a mano.</w:t>
+        <w:t xml:space="preserve"> cuando dos sistemas de software distintos (por ejemplo, SEMA y Alma) se conectan entre sí para compartir información automáticamente, sin que alguien tenga que copiar y pegar a mano.</w:t>
       </w:r>
     </w:p>
     <w:p>
@@ -1337,7 +1337,7 @@
           <w:color w:val="2A221E"/>
           <w:sz w:val="23"/>
         </w:rPr>
-        <w:t xml:space="preserve"> la pestaña "Biblioteca UAM" que ya existe hoy dentro de Folio es, en realidad, una lista fija de unos 40 libros que capturamos nosotros a mano, y la "disponibilidad" que se muestra (si un libro está prestado o no) está inventada — es un resultado calculado con una fórmula interna, no información real de la biblioteca. La propia app ya le avisa al usuario "Próximamente: catálogo completo de la Biblioteca UAM-I con disponibilidad en tiempo real" — es justo la promesa que una integración de verdad con BIDIUAM nos permitiría cumplir.</w:t>
+        <w:t xml:space="preserve"> la pestaña "Biblioteca UAM" que ya existe hoy dentro de SEMA es, en realidad, una lista fija de unos 40 libros que capturamos nosotros a mano, y la "disponibilidad" que se muestra (si un libro está prestado o no) está inventada — es un resultado calculado con una fórmula interna, no información real de la biblioteca. La propia app ya le avisa al usuario "Próximamente: catálogo completo de la Biblioteca UAM-I con disponibilidad en tiempo real" — es justo la promesa que una integración de verdad con BIDIUAM nos permitiría cumplir.</w:t>
       </w:r>
     </w:p>
     <w:p>
@@ -1352,7 +1352,7 @@
           <w:color w:val="2A221E"/>
           <w:sz w:val="23"/>
         </w:rPr>
-        <w:t>Falta también: el pago real de la versión paga de Folio (hoy se activa a mano, sin cobrar), y pruebas automatizadas que hoy no existen. Nada de esto es un secreto — es simplemente en qué etapa está el proyecto, y está bien que sea así para el tamaño del equipo que lo construyó.</w:t>
+        <w:t>Falta también: el pago real de la versión paga de SEMA (hoy se activa a mano, sin cobrar), y pruebas automatizadas que hoy no existen. Nada de esto es un secreto — es simplemente en qué etapa está el proyecto, y está bien que sea así para el tamaño del equipo que lo construyó.</w:t>
       </w:r>
     </w:p>
     <w:p>
@@ -1635,7 +1635,7 @@
           <w:color w:val="2A221E"/>
           <w:sz w:val="23"/>
         </w:rPr>
-        <w:t xml:space="preserve"> Son la moneda del juego dentro de Folio. Se ganan automáticamente al terminar un libro, al registrar sesiones de lectura, y por reclamar un premio diario. Se gastan, por ejemplo, para comprar más intentos en el juego de recomendaciones (BookTinder, ver sección 12) o para buscar intercambios de libros en el Trueque. Igual que con la mascota, el servidor es el único que puede sumar o restar gemas — el celular solo las muestra.</w:t>
+        <w:t xml:space="preserve"> Son la moneda del juego dentro de SEMA. Se ganan automáticamente al terminar un libro, al registrar sesiones de lectura, y por reclamar un premio diario. Se gastan, por ejemplo, para comprar más intentos en el juego de recomendaciones (BookTinder, ver sección 12) o para buscar intercambios de libros en el Trueque. Igual que con la mascota, el servidor es el único que puede sumar o restar gemas — el celular solo las muestra.</w:t>
       </w:r>
     </w:p>
     <w:p>
@@ -2020,7 +2020,7 @@
           <w:color w:val="2A221E"/>
           <w:sz w:val="23"/>
         </w:rPr>
-        <w:t xml:space="preserve"> el Trueque es la sección donde dos personas que usan Folio pueden intercambiar libros físicos entre ellas, si viven cerca.</w:t>
+        <w:t xml:space="preserve"> el Trueque es la sección donde dos personas que usan SEMA pueden intercambiar libros físicos entre ellas, si viven cerca.</w:t>
       </w:r>
     </w:p>
     <w:p>
@@ -2311,7 +2311,7 @@
           <w:color w:val="2A221E"/>
           <w:sz w:val="23"/>
         </w:rPr>
-        <w:t>Los puntos que funcionan exactamente así en Folio son: la experiencia y el nivel de la mascota, las gemas, los logros, y la racha diaria. Ninguno de los cuatro se puede falsificar desde el celular.</w:t>
+        <w:t>Los puntos que funcionan exactamente así en SEMA son: la experiencia y el nivel de la mascota, las gemas, los logros, y la racha diaria. Ninguno de los cuatro se puede falsificar desde el celular.</w:t>
       </w:r>
     </w:p>
     <w:p>
@@ -2399,7 +2399,7 @@
           <w:color w:val="2A221E"/>
           <w:sz w:val="23"/>
         </w:rPr>
-        <w:t>Hay que ser honestos con las desventajas también: al no estar en las tiendas de apps, Folio no aparece cuando alguien busca "apps de lectura" en la App Store o en Google Play; las notificaciones en iPhone funcionan distinto y de forma más limitada en una PWA que en una app nativa; y algunos usuarios, sobre todo los menos acostumbrados a la tecnología, no saben que pueden "instalar" una página web y se quedan usándola solo desde el navegador.</w:t>
+        <w:t>Hay que ser honestos con las desventajas también: al no estar en las tiendas de apps, SEMA no aparece cuando alguien busca "apps de lectura" en la App Store o en Google Play; las notificaciones en iPhone funcionan distinto y de forma más limitada en una PWA que en una app nativa; y algunos usuarios, sobre todo los menos acostumbrados a la tecnología, no saben que pueden "instalar" una página web y se quedan usándola solo desde el navegador.</w:t>
       </w:r>
     </w:p>
     <w:p>
@@ -2467,7 +2467,7 @@
           <w:color w:val="2A221E"/>
           <w:sz w:val="23"/>
         </w:rPr>
-        <w:t xml:space="preserve"> hoy, cualquier persona se puede registrar en Folio con cualquier correo —Gmail, Hotmail, lo que sea—. Eso significa que, tal como está la app ahorita, alguien que no es alumno de la UAM podría entrar a la sección de la Biblioteca UAM y, eventualmente, al catálogo real de BIDIUAM, algo que la propia UAM nos pidió que no pase.</w:t>
+        <w:t xml:space="preserve"> hoy, cualquier persona se puede registrar en SEMA con cualquier correo —Gmail, Hotmail, lo que sea—. Eso significa que, tal como está la app ahorita, alguien que no es alumno de la UAM podría entrar a la sección de la Biblioteca UAM y, eventualmente, al catálogo real de BIDIUAM, algo que la propia UAM nos pidió que no pase.</w:t>
       </w:r>
     </w:p>
     <w:p>
@@ -2787,7 +2787,7 @@
           <w:color w:val="2A221E"/>
           <w:sz w:val="23"/>
         </w:rPr>
-        <w:t>•  Folio Plus (la versión de paga) ya existe como concepto dentro del código, pero hoy se activa manualmente para cada usuario; no hay ningún cobro real todavía integrado.</w:t>
+        <w:t>•  SEMA Plus (la versión de paga) ya existe como concepto dentro del código, pero hoy se activa manualmente para cada usuario; no hay ningún cobro real todavía integrado.</w:t>
       </w:r>
     </w:p>
     <w:p>
@@ -2848,7 +2848,7 @@
           <w:color w:val="2A221E"/>
           <w:sz w:val="23"/>
         </w:rPr>
-        <w:t xml:space="preserve"> la app no se ha probado todavía con miles de usuarios usándola al mismo tiempo. El proveedor que rentamos (Supabase) sí está preparado para eso, pero nosotros no hemos verificado que todo en Folio se comporte igual de bien a esa escala.</w:t>
+        <w:t xml:space="preserve"> la app no se ha probado todavía con miles de usuarios usándola al mismo tiempo. El proveedor que rentamos (Supabase) sí está preparado para eso, pero nosotros no hemos verificado que todo en SEMA se comporte igual de bien a esa escala.</w:t>
       </w:r>
     </w:p>
     <w:p>

</xml_diff>